<commit_message>
Aggiornato stato avanzamento task nel Project Plan
</commit_message>
<xml_diff>
--- a/doc/Project_Plan.docx
+++ b/doc/Project_Plan.docx
@@ -31,91 +31,148 @@
       <w:pPr>
         <w:numPr>
           <w:ilvl w:val="0"/>
-          <w:numId w:val="1"/>
+          <w:numId w:val="4"/>
         </w:numPr>
       </w:pPr>
-      <w:r>
-        <w:t>Setup iniziale del repository GitHub e condivisione.</w:t>
-      </w:r>
-    </w:p>
-    <w:p>
-      <w:pPr>
-        <w:numPr>
-          <w:ilvl w:val="0"/>
-          <w:numId w:val="1"/>
-        </w:numPr>
-      </w:pPr>
-      <w:r>
-        <w:t xml:space="preserve">Creazione dello scheletro delle classi (Modelli: Utente, Proiezione, Prenotazione e classe </w:t>
-      </w:r>
-      <w:proofErr w:type="spellStart"/>
-      <w:r>
-        <w:t>CineMax</w:t>
-      </w:r>
-      <w:proofErr w:type="spellEnd"/>
-      <w:r>
-        <w:t xml:space="preserve"> col </w:t>
-      </w:r>
-      <w:proofErr w:type="spellStart"/>
-      <w:r>
-        <w:t>main</w:t>
-      </w:r>
-      <w:proofErr w:type="spellEnd"/>
-      <w:r>
-        <w:t>).</w:t>
-      </w:r>
-    </w:p>
-    <w:p>
-      <w:pPr>
-        <w:numPr>
-          <w:ilvl w:val="0"/>
-          <w:numId w:val="1"/>
-        </w:numPr>
-      </w:pPr>
-      <w:r>
-        <w:t>Sviluppo Gestione I/O (lettura/scrittura da .csv o file).</w:t>
-      </w:r>
-    </w:p>
-    <w:p>
-      <w:pPr>
-        <w:numPr>
-          <w:ilvl w:val="0"/>
-          <w:numId w:val="1"/>
-        </w:numPr>
-      </w:pPr>
-      <w:r>
-        <w:t xml:space="preserve">Sviluppo Funzionalità </w:t>
-      </w:r>
       <w:r>
         <w:rPr>
           <w:b/>
           <w:bCs/>
         </w:rPr>
-        <w:t>Guest</w:t>
-      </w:r>
-      <w:r>
-        <w:t>: Ricerca proiezioni e calcolo posti liberi.</w:t>
+        <w:t>[COMPLETATO]</w:t>
+      </w:r>
+      <w:r>
+        <w:t xml:space="preserve"> Setup iniziale del repository GitHub e condivisione.</w:t>
       </w:r>
     </w:p>
     <w:p>
       <w:pPr>
         <w:numPr>
           <w:ilvl w:val="0"/>
-          <w:numId w:val="1"/>
+          <w:numId w:val="4"/>
         </w:numPr>
       </w:pPr>
-      <w:r>
-        <w:t xml:space="preserve">Sviluppo Funzionalità </w:t>
-      </w:r>
       <w:r>
         <w:rPr>
           <w:b/>
           <w:bCs/>
         </w:rPr>
-        <w:t>Cliente</w:t>
-      </w:r>
-      <w:r>
-        <w:t>: Registrazione, Login, Creazione, Modifica ed Eliminazione Prenotazioni.</w:t>
+        <w:t>[COMPLETATO]</w:t>
+      </w:r>
+      <w:r>
+        <w:t xml:space="preserve"> Creazione dello scheletro delle classi (Modelli: Utente, Proiezione, Prenotazione e classe </w:t>
+      </w:r>
+      <w:proofErr w:type="spellStart"/>
+      <w:r>
+        <w:t>CineMax</w:t>
+      </w:r>
+      <w:proofErr w:type="spellEnd"/>
+      <w:r>
+        <w:t xml:space="preserve"> col </w:t>
+      </w:r>
+      <w:proofErr w:type="spellStart"/>
+      <w:r>
+        <w:t>main</w:t>
+      </w:r>
+      <w:proofErr w:type="spellEnd"/>
+      <w:r>
+        <w:t>).</w:t>
+      </w:r>
+    </w:p>
+    <w:p>
+      <w:pPr>
+        <w:numPr>
+          <w:ilvl w:val="0"/>
+          <w:numId w:val="4"/>
+        </w:numPr>
+      </w:pPr>
+      <w:r>
+        <w:rPr>
+          <w:b/>
+          <w:bCs/>
+        </w:rPr>
+        <w:t>[COMPLETATO]</w:t>
+      </w:r>
+      <w:r>
+        <w:t xml:space="preserve"> Sviluppo Gestione I/O (lettura/scrittura da .csv e persistenza sicura su file binari .</w:t>
+      </w:r>
+      <w:proofErr w:type="spellStart"/>
+      <w:r>
+        <w:t>dat</w:t>
+      </w:r>
+      <w:proofErr w:type="spellEnd"/>
+      <w:r>
+        <w:t>).</w:t>
+      </w:r>
+    </w:p>
+    <w:p>
+      <w:pPr>
+        <w:numPr>
+          <w:ilvl w:val="0"/>
+          <w:numId w:val="4"/>
+        </w:numPr>
+      </w:pPr>
+      <w:r>
+        <w:rPr>
+          <w:b/>
+          <w:bCs/>
+        </w:rPr>
+        <w:t>[COMPLETATO]</w:t>
+      </w:r>
+      <w:r>
+        <w:t xml:space="preserve"> Sviluppo Funzionalità Guest: Ricerca proiezioni e calcolo posti liberi.</w:t>
+      </w:r>
+    </w:p>
+    <w:p>
+      <w:pPr>
+        <w:numPr>
+          <w:ilvl w:val="0"/>
+          <w:numId w:val="4"/>
+        </w:numPr>
+      </w:pPr>
+      <w:r>
+        <w:rPr>
+          <w:b/>
+          <w:bCs/>
+        </w:rPr>
+        <w:t>[COMPLETATO]</w:t>
+      </w:r>
+      <w:r>
+        <w:t xml:space="preserve"> Sviluppo Funzionalità Cliente: Registrazione, Login, Prenotazione, visualizzazione Storico Biglietti ed eliminazione.</w:t>
+      </w:r>
+    </w:p>
+    <w:p>
+      <w:pPr>
+        <w:numPr>
+          <w:ilvl w:val="0"/>
+          <w:numId w:val="4"/>
+        </w:numPr>
+      </w:pPr>
+      <w:r>
+        <w:rPr>
+          <w:b/>
+          <w:bCs/>
+        </w:rPr>
+        <w:t>[COMPLETATO]</w:t>
+      </w:r>
+      <w:r>
+        <w:t xml:space="preserve"> </w:t>
+      </w:r>
+      <w:proofErr w:type="spellStart"/>
+      <w:r>
+        <w:t>Refactoring</w:t>
+      </w:r>
+      <w:proofErr w:type="spellEnd"/>
+      <w:r>
+        <w:t xml:space="preserve"> architetturale: Incapsulamento delle liste in </w:t>
+      </w:r>
+      <w:proofErr w:type="spellStart"/>
+      <w:r>
+        <w:t>GestoreDati</w:t>
+      </w:r>
+      <w:proofErr w:type="spellEnd"/>
+      <w:r>
+        <w:t xml:space="preserve"> e messa in sicurezza dei salvataggi.</w:t>
       </w:r>
     </w:p>
     <w:p>
@@ -147,53 +204,54 @@
       <w:pPr>
         <w:numPr>
           <w:ilvl w:val="0"/>
-          <w:numId w:val="2"/>
+          <w:numId w:val="5"/>
         </w:numPr>
       </w:pPr>
-      <w:r>
-        <w:t xml:space="preserve">Sviluppo Funzionalità </w:t>
-      </w:r>
       <w:r>
         <w:rPr>
           <w:b/>
           <w:bCs/>
         </w:rPr>
-        <w:t>Proiezionista</w:t>
-      </w:r>
-      <w:r>
-        <w:t>: Inserimento, Modifica (data/ora) ed Eliminazione Proiezioni (con controlli sulle prenotazioni attive).</w:t>
+        <w:t>[DA FARE]</w:t>
+      </w:r>
+      <w:r>
+        <w:t xml:space="preserve"> Sviluppo Funzionalità Proiezionista: Inserimento, Modifica (data/ora) ed Eliminazione Proiezioni (con controlli sulle prenotazioni attive).</w:t>
       </w:r>
     </w:p>
     <w:p>
       <w:pPr>
         <w:numPr>
           <w:ilvl w:val="0"/>
-          <w:numId w:val="2"/>
+          <w:numId w:val="5"/>
         </w:numPr>
       </w:pPr>
-      <w:r>
-        <w:t xml:space="preserve">Sviluppo Funzionalità </w:t>
-      </w:r>
       <w:r>
         <w:rPr>
           <w:b/>
           <w:bCs/>
         </w:rPr>
-        <w:t>Bigliettaio</w:t>
-      </w:r>
-      <w:r>
-        <w:t>: Ricerca prenotazioni (per codice, utente, data) e visualizzazione dettagliata (focus sulla data odierna).</w:t>
+        <w:t>[DA FARE]</w:t>
+      </w:r>
+      <w:r>
+        <w:t xml:space="preserve"> Sviluppo Funzionalità Bigliettaio: Ricerca prenotazioni (per codice, utente, data) e visualizzazione dettagliata (focus sulla data odierna).</w:t>
       </w:r>
     </w:p>
     <w:p>
       <w:pPr>
         <w:numPr>
           <w:ilvl w:val="0"/>
-          <w:numId w:val="2"/>
+          <w:numId w:val="5"/>
         </w:numPr>
       </w:pPr>
       <w:r>
-        <w:t>Inizializzazione file utenti con i 2 proiezionisti e 5 bigliettai (come da specifiche).</w:t>
+        <w:rPr>
+          <w:b/>
+          <w:bCs/>
+        </w:rPr>
+        <w:t>[DA FARE]</w:t>
+      </w:r>
+      <w:r>
+        <w:t xml:space="preserve"> Inizializzazione file utenti con i 2 proiezionisti e 5 bigliettai (come da specifiche).</w:t>
       </w:r>
     </w:p>
     <w:p>
@@ -209,87 +267,98 @@
       <w:pPr>
         <w:numPr>
           <w:ilvl w:val="0"/>
-          <w:numId w:val="3"/>
+          <w:numId w:val="6"/>
         </w:numPr>
       </w:pPr>
-      <w:r>
-        <w:t>Revisione costante del codice prodotto da me e Anes (naming, formattazione, gestione errori).</w:t>
-      </w:r>
-    </w:p>
-    <w:p>
-      <w:pPr>
-        <w:numPr>
-          <w:ilvl w:val="0"/>
-          <w:numId w:val="3"/>
-        </w:numPr>
-      </w:pPr>
-      <w:r>
-        <w:t xml:space="preserve">Stesura del </w:t>
-      </w:r>
       <w:r>
         <w:rPr>
           <w:b/>
           <w:bCs/>
         </w:rPr>
-        <w:t>Manuale Utente</w:t>
-      </w:r>
-      <w:r>
-        <w:t xml:space="preserve"> (come usare la TUI, inserire screenshot, requisiti, istruzioni di lancio).</w:t>
+        <w:t>[IN CORSO]</w:t>
+      </w:r>
+      <w:r>
+        <w:t xml:space="preserve"> Revisione costante del codice prodotto da me e Anes (naming, formattazione, gestione errori).</w:t>
       </w:r>
     </w:p>
     <w:p>
       <w:pPr>
         <w:numPr>
           <w:ilvl w:val="0"/>
-          <w:numId w:val="3"/>
+          <w:numId w:val="6"/>
         </w:numPr>
       </w:pPr>
-      <w:r>
-        <w:t xml:space="preserve">Stesura del </w:t>
-      </w:r>
       <w:r>
         <w:rPr>
           <w:b/>
           <w:bCs/>
         </w:rPr>
-        <w:t>Manuale Tecnico</w:t>
-      </w:r>
-      <w:r>
-        <w:t xml:space="preserve"> (descrizione architettura, file I/O, algoritmi usati).</w:t>
+        <w:t>[IN CORSO]</w:t>
+      </w:r>
+      <w:r>
+        <w:t xml:space="preserve"> Stesura del Manuale Utente (come usare la TUI, inserire screenshot, requisiti, istruzioni di lancio).</w:t>
       </w:r>
     </w:p>
     <w:p>
       <w:pPr>
         <w:numPr>
           <w:ilvl w:val="0"/>
-          <w:numId w:val="3"/>
+          <w:numId w:val="6"/>
         </w:numPr>
       </w:pPr>
-      <w:r>
-        <w:t xml:space="preserve">Controllo finale e stesura della </w:t>
-      </w:r>
-      <w:proofErr w:type="spellStart"/>
       <w:r>
         <w:rPr>
           <w:b/>
           <w:bCs/>
         </w:rPr>
-        <w:t>JavaDoc</w:t>
-      </w:r>
-      <w:proofErr w:type="spellEnd"/>
-      <w:r>
-        <w:t xml:space="preserve"> (verifica che tutti i metodi/classi abbiano i tag corretti: @author, @param, @return, ecc.).</w:t>
+        <w:t>[DA FARE]</w:t>
+      </w:r>
+      <w:r>
+        <w:t xml:space="preserve"> Stesura del Manuale Tecnico (descrizione architettura, file I/O, algoritmi usati).</w:t>
       </w:r>
     </w:p>
     <w:p>
       <w:pPr>
         <w:numPr>
           <w:ilvl w:val="0"/>
-          <w:numId w:val="3"/>
+          <w:numId w:val="6"/>
         </w:numPr>
       </w:pPr>
       <w:r>
-        <w:t>Stesura file README.txt e autori.txt per la consegna.</w:t>
+        <w:rPr>
+          <w:b/>
+          <w:bCs/>
+        </w:rPr>
+        <w:t>[DA FARE]</w:t>
+      </w:r>
+      <w:r>
+        <w:t xml:space="preserve"> Controllo finale e stesura della </w:t>
+      </w:r>
+      <w:proofErr w:type="spellStart"/>
+      <w:r>
+        <w:t>JavaDoc</w:t>
+      </w:r>
+      <w:proofErr w:type="spellEnd"/>
+      <w:r>
+        <w:t xml:space="preserve"> (verifica che tutti i metodi/classi abbiano i tag corretti: @author, @param, @return, ecc.).</w:t>
+      </w:r>
+    </w:p>
+    <w:p>
+      <w:pPr>
+        <w:numPr>
+          <w:ilvl w:val="0"/>
+          <w:numId w:val="6"/>
+        </w:numPr>
+      </w:pPr>
+      <w:r>
+        <w:rPr>
+          <w:b/>
+          <w:bCs/>
+        </w:rPr>
+        <w:t>[DA FARE]</w:t>
+      </w:r>
+      <w:r>
+        <w:t xml:space="preserve"> Stesura file README.txt e autori.txt per la consegna.</w:t>
       </w:r>
     </w:p>
     <w:p/>
@@ -306,6 +375,304 @@
 <file path=word/numbering.xml><?xml version="1.0" encoding="utf-8"?>
 <w:numbering xmlns:wpc="http://schemas.microsoft.com/office/word/2010/wordprocessingCanvas" xmlns:cx="http://schemas.microsoft.com/office/drawing/2014/chartex" xmlns:cx1="http://schemas.microsoft.com/office/drawing/2015/9/8/chartex" xmlns:cx2="http://schemas.microsoft.com/office/drawing/2015/10/21/chartex" xmlns:cx3="http://schemas.microsoft.com/office/drawing/2016/5/9/chartex" xmlns:cx4="http://schemas.microsoft.com/office/drawing/2016/5/10/chartex" xmlns:cx5="http://schemas.microsoft.com/office/drawing/2016/5/11/chartex" xmlns:cx6="http://schemas.microsoft.com/office/drawing/2016/5/12/chartex" xmlns:cx7="http://schemas.microsoft.com/office/drawing/2016/5/13/chartex" xmlns:cx8="http://schemas.microsoft.com/office/drawing/2016/5/14/chartex" xmlns:mc="http://schemas.openxmlformats.org/markup-compatibility/2006" xmlns:aink="http://schemas.microsoft.com/office/drawing/2016/ink" xmlns:am3d="http://schemas.microsoft.com/office/drawing/2017/model3d" xmlns:o="urn:schemas-microsoft-com:office:office" xmlns:oel="http://schemas.microsoft.com/office/2019/extlst" xmlns:r="http://schemas.openxmlformats.org/officeDocument/2006/relationships" xmlns:m="http://schemas.openxmlformats.org/officeDocument/2006/math" xmlns:v="urn:schemas-microsoft-com:vml" xmlns:wp14="http://schemas.microsoft.com/office/word/2010/wordprocessingDrawing" xmlns:wp="http://schemas.openxmlformats.org/drawingml/2006/wordprocessingDrawing" xmlns:w10="urn:schemas-microsoft-com:office:word" xmlns:w="http://schemas.openxmlformats.org/wordprocessingml/2006/main" xmlns:w14="http://schemas.microsoft.com/office/word/2010/wordml" xmlns:w15="http://schemas.microsoft.com/office/word/2012/wordml" xmlns:w16cex="http://schemas.microsoft.com/office/word/2018/wordml/cex" xmlns:w16cid="http://schemas.microsoft.com/office/word/2016/wordml/cid" xmlns:w16="http://schemas.microsoft.com/office/word/2018/wordml" xmlns:w16du="http://schemas.microsoft.com/office/word/2023/wordml/word16du" xmlns:w16sdtdh="http://schemas.microsoft.com/office/word/2020/wordml/sdtdatahash" xmlns:w16sdtfl="http://schemas.microsoft.com/office/word/2024/wordml/sdtformatlock" xmlns:w16se="http://schemas.microsoft.com/office/word/2015/wordml/symex" xmlns:wpg="http://schemas.microsoft.com/office/word/2010/wordprocessingGroup" xmlns:wpi="http://schemas.microsoft.com/office/word/2010/wordprocessingInk" xmlns:wne="http://schemas.microsoft.com/office/word/2006/wordml" xmlns:wps="http://schemas.microsoft.com/office/word/2010/wordprocessingShape" mc:Ignorable="w14 w15 w16se w16cid w16 w16cex w16sdtdh w16sdtfl w16du wp14">
   <w:abstractNum w:abstractNumId="0" w15:restartNumberingAfterBreak="0">
+    <w:nsid w:val="07F85A01"/>
+    <w:multiLevelType w:val="multilevel"/>
+    <w:tmpl w:val="3A927AFA"/>
+    <w:lvl w:ilvl="0">
+      <w:start w:val="1"/>
+      <w:numFmt w:val="bullet"/>
+      <w:lvlText w:val=""/>
+      <w:lvlJc w:val="left"/>
+      <w:pPr>
+        <w:tabs>
+          <w:tab w:val="num" w:pos="720"/>
+        </w:tabs>
+        <w:ind w:left="720" w:hanging="360"/>
+      </w:pPr>
+      <w:rPr>
+        <w:rFonts w:ascii="Symbol" w:hAnsi="Symbol" w:hint="default"/>
+        <w:sz w:val="20"/>
+      </w:rPr>
+    </w:lvl>
+    <w:lvl w:ilvl="1" w:tentative="1">
+      <w:start w:val="1"/>
+      <w:numFmt w:val="bullet"/>
+      <w:lvlText w:val="o"/>
+      <w:lvlJc w:val="left"/>
+      <w:pPr>
+        <w:tabs>
+          <w:tab w:val="num" w:pos="1440"/>
+        </w:tabs>
+        <w:ind w:left="1440" w:hanging="360"/>
+      </w:pPr>
+      <w:rPr>
+        <w:rFonts w:ascii="Courier New" w:hAnsi="Courier New" w:hint="default"/>
+        <w:sz w:val="20"/>
+      </w:rPr>
+    </w:lvl>
+    <w:lvl w:ilvl="2" w:tentative="1">
+      <w:start w:val="1"/>
+      <w:numFmt w:val="bullet"/>
+      <w:lvlText w:val=""/>
+      <w:lvlJc w:val="left"/>
+      <w:pPr>
+        <w:tabs>
+          <w:tab w:val="num" w:pos="2160"/>
+        </w:tabs>
+        <w:ind w:left="2160" w:hanging="360"/>
+      </w:pPr>
+      <w:rPr>
+        <w:rFonts w:ascii="Wingdings" w:hAnsi="Wingdings" w:hint="default"/>
+        <w:sz w:val="20"/>
+      </w:rPr>
+    </w:lvl>
+    <w:lvl w:ilvl="3" w:tentative="1">
+      <w:start w:val="1"/>
+      <w:numFmt w:val="bullet"/>
+      <w:lvlText w:val=""/>
+      <w:lvlJc w:val="left"/>
+      <w:pPr>
+        <w:tabs>
+          <w:tab w:val="num" w:pos="2880"/>
+        </w:tabs>
+        <w:ind w:left="2880" w:hanging="360"/>
+      </w:pPr>
+      <w:rPr>
+        <w:rFonts w:ascii="Wingdings" w:hAnsi="Wingdings" w:hint="default"/>
+        <w:sz w:val="20"/>
+      </w:rPr>
+    </w:lvl>
+    <w:lvl w:ilvl="4" w:tentative="1">
+      <w:start w:val="1"/>
+      <w:numFmt w:val="bullet"/>
+      <w:lvlText w:val=""/>
+      <w:lvlJc w:val="left"/>
+      <w:pPr>
+        <w:tabs>
+          <w:tab w:val="num" w:pos="3600"/>
+        </w:tabs>
+        <w:ind w:left="3600" w:hanging="360"/>
+      </w:pPr>
+      <w:rPr>
+        <w:rFonts w:ascii="Wingdings" w:hAnsi="Wingdings" w:hint="default"/>
+        <w:sz w:val="20"/>
+      </w:rPr>
+    </w:lvl>
+    <w:lvl w:ilvl="5" w:tentative="1">
+      <w:start w:val="1"/>
+      <w:numFmt w:val="bullet"/>
+      <w:lvlText w:val=""/>
+      <w:lvlJc w:val="left"/>
+      <w:pPr>
+        <w:tabs>
+          <w:tab w:val="num" w:pos="4320"/>
+        </w:tabs>
+        <w:ind w:left="4320" w:hanging="360"/>
+      </w:pPr>
+      <w:rPr>
+        <w:rFonts w:ascii="Wingdings" w:hAnsi="Wingdings" w:hint="default"/>
+        <w:sz w:val="20"/>
+      </w:rPr>
+    </w:lvl>
+    <w:lvl w:ilvl="6" w:tentative="1">
+      <w:start w:val="1"/>
+      <w:numFmt w:val="bullet"/>
+      <w:lvlText w:val=""/>
+      <w:lvlJc w:val="left"/>
+      <w:pPr>
+        <w:tabs>
+          <w:tab w:val="num" w:pos="5040"/>
+        </w:tabs>
+        <w:ind w:left="5040" w:hanging="360"/>
+      </w:pPr>
+      <w:rPr>
+        <w:rFonts w:ascii="Wingdings" w:hAnsi="Wingdings" w:hint="default"/>
+        <w:sz w:val="20"/>
+      </w:rPr>
+    </w:lvl>
+    <w:lvl w:ilvl="7" w:tentative="1">
+      <w:start w:val="1"/>
+      <w:numFmt w:val="bullet"/>
+      <w:lvlText w:val=""/>
+      <w:lvlJc w:val="left"/>
+      <w:pPr>
+        <w:tabs>
+          <w:tab w:val="num" w:pos="5760"/>
+        </w:tabs>
+        <w:ind w:left="5760" w:hanging="360"/>
+      </w:pPr>
+      <w:rPr>
+        <w:rFonts w:ascii="Wingdings" w:hAnsi="Wingdings" w:hint="default"/>
+        <w:sz w:val="20"/>
+      </w:rPr>
+    </w:lvl>
+    <w:lvl w:ilvl="8" w:tentative="1">
+      <w:start w:val="1"/>
+      <w:numFmt w:val="bullet"/>
+      <w:lvlText w:val=""/>
+      <w:lvlJc w:val="left"/>
+      <w:pPr>
+        <w:tabs>
+          <w:tab w:val="num" w:pos="6480"/>
+        </w:tabs>
+        <w:ind w:left="6480" w:hanging="360"/>
+      </w:pPr>
+      <w:rPr>
+        <w:rFonts w:ascii="Wingdings" w:hAnsi="Wingdings" w:hint="default"/>
+        <w:sz w:val="20"/>
+      </w:rPr>
+    </w:lvl>
+  </w:abstractNum>
+  <w:abstractNum w:abstractNumId="1" w15:restartNumberingAfterBreak="0">
+    <w:nsid w:val="11A0667D"/>
+    <w:multiLevelType w:val="multilevel"/>
+    <w:tmpl w:val="0F6E490E"/>
+    <w:lvl w:ilvl="0">
+      <w:start w:val="1"/>
+      <w:numFmt w:val="bullet"/>
+      <w:lvlText w:val=""/>
+      <w:lvlJc w:val="left"/>
+      <w:pPr>
+        <w:tabs>
+          <w:tab w:val="num" w:pos="720"/>
+        </w:tabs>
+        <w:ind w:left="720" w:hanging="360"/>
+      </w:pPr>
+      <w:rPr>
+        <w:rFonts w:ascii="Symbol" w:hAnsi="Symbol" w:hint="default"/>
+        <w:sz w:val="20"/>
+      </w:rPr>
+    </w:lvl>
+    <w:lvl w:ilvl="1" w:tentative="1">
+      <w:start w:val="1"/>
+      <w:numFmt w:val="bullet"/>
+      <w:lvlText w:val="o"/>
+      <w:lvlJc w:val="left"/>
+      <w:pPr>
+        <w:tabs>
+          <w:tab w:val="num" w:pos="1440"/>
+        </w:tabs>
+        <w:ind w:left="1440" w:hanging="360"/>
+      </w:pPr>
+      <w:rPr>
+        <w:rFonts w:ascii="Courier New" w:hAnsi="Courier New" w:hint="default"/>
+        <w:sz w:val="20"/>
+      </w:rPr>
+    </w:lvl>
+    <w:lvl w:ilvl="2" w:tentative="1">
+      <w:start w:val="1"/>
+      <w:numFmt w:val="bullet"/>
+      <w:lvlText w:val=""/>
+      <w:lvlJc w:val="left"/>
+      <w:pPr>
+        <w:tabs>
+          <w:tab w:val="num" w:pos="2160"/>
+        </w:tabs>
+        <w:ind w:left="2160" w:hanging="360"/>
+      </w:pPr>
+      <w:rPr>
+        <w:rFonts w:ascii="Wingdings" w:hAnsi="Wingdings" w:hint="default"/>
+        <w:sz w:val="20"/>
+      </w:rPr>
+    </w:lvl>
+    <w:lvl w:ilvl="3" w:tentative="1">
+      <w:start w:val="1"/>
+      <w:numFmt w:val="bullet"/>
+      <w:lvlText w:val=""/>
+      <w:lvlJc w:val="left"/>
+      <w:pPr>
+        <w:tabs>
+          <w:tab w:val="num" w:pos="2880"/>
+        </w:tabs>
+        <w:ind w:left="2880" w:hanging="360"/>
+      </w:pPr>
+      <w:rPr>
+        <w:rFonts w:ascii="Wingdings" w:hAnsi="Wingdings" w:hint="default"/>
+        <w:sz w:val="20"/>
+      </w:rPr>
+    </w:lvl>
+    <w:lvl w:ilvl="4" w:tentative="1">
+      <w:start w:val="1"/>
+      <w:numFmt w:val="bullet"/>
+      <w:lvlText w:val=""/>
+      <w:lvlJc w:val="left"/>
+      <w:pPr>
+        <w:tabs>
+          <w:tab w:val="num" w:pos="3600"/>
+        </w:tabs>
+        <w:ind w:left="3600" w:hanging="360"/>
+      </w:pPr>
+      <w:rPr>
+        <w:rFonts w:ascii="Wingdings" w:hAnsi="Wingdings" w:hint="default"/>
+        <w:sz w:val="20"/>
+      </w:rPr>
+    </w:lvl>
+    <w:lvl w:ilvl="5" w:tentative="1">
+      <w:start w:val="1"/>
+      <w:numFmt w:val="bullet"/>
+      <w:lvlText w:val=""/>
+      <w:lvlJc w:val="left"/>
+      <w:pPr>
+        <w:tabs>
+          <w:tab w:val="num" w:pos="4320"/>
+        </w:tabs>
+        <w:ind w:left="4320" w:hanging="360"/>
+      </w:pPr>
+      <w:rPr>
+        <w:rFonts w:ascii="Wingdings" w:hAnsi="Wingdings" w:hint="default"/>
+        <w:sz w:val="20"/>
+      </w:rPr>
+    </w:lvl>
+    <w:lvl w:ilvl="6" w:tentative="1">
+      <w:start w:val="1"/>
+      <w:numFmt w:val="bullet"/>
+      <w:lvlText w:val=""/>
+      <w:lvlJc w:val="left"/>
+      <w:pPr>
+        <w:tabs>
+          <w:tab w:val="num" w:pos="5040"/>
+        </w:tabs>
+        <w:ind w:left="5040" w:hanging="360"/>
+      </w:pPr>
+      <w:rPr>
+        <w:rFonts w:ascii="Wingdings" w:hAnsi="Wingdings" w:hint="default"/>
+        <w:sz w:val="20"/>
+      </w:rPr>
+    </w:lvl>
+    <w:lvl w:ilvl="7" w:tentative="1">
+      <w:start w:val="1"/>
+      <w:numFmt w:val="bullet"/>
+      <w:lvlText w:val=""/>
+      <w:lvlJc w:val="left"/>
+      <w:pPr>
+        <w:tabs>
+          <w:tab w:val="num" w:pos="5760"/>
+        </w:tabs>
+        <w:ind w:left="5760" w:hanging="360"/>
+      </w:pPr>
+      <w:rPr>
+        <w:rFonts w:ascii="Wingdings" w:hAnsi="Wingdings" w:hint="default"/>
+        <w:sz w:val="20"/>
+      </w:rPr>
+    </w:lvl>
+    <w:lvl w:ilvl="8" w:tentative="1">
+      <w:start w:val="1"/>
+      <w:numFmt w:val="bullet"/>
+      <w:lvlText w:val=""/>
+      <w:lvlJc w:val="left"/>
+      <w:pPr>
+        <w:tabs>
+          <w:tab w:val="num" w:pos="6480"/>
+        </w:tabs>
+        <w:ind w:left="6480" w:hanging="360"/>
+      </w:pPr>
+      <w:rPr>
+        <w:rFonts w:ascii="Wingdings" w:hAnsi="Wingdings" w:hint="default"/>
+        <w:sz w:val="20"/>
+      </w:rPr>
+    </w:lvl>
+  </w:abstractNum>
+  <w:abstractNum w:abstractNumId="2" w15:restartNumberingAfterBreak="0">
     <w:nsid w:val="2B9B1815"/>
     <w:multiLevelType w:val="multilevel"/>
     <w:tmpl w:val="21449832"/>
@@ -454,7 +821,7 @@
       </w:rPr>
     </w:lvl>
   </w:abstractNum>
-  <w:abstractNum w:abstractNumId="1" w15:restartNumberingAfterBreak="0">
+  <w:abstractNum w:abstractNumId="3" w15:restartNumberingAfterBreak="0">
     <w:nsid w:val="636E33AB"/>
     <w:multiLevelType w:val="multilevel"/>
     <w:tmpl w:val="C42A11FA"/>
@@ -603,7 +970,7 @@
       </w:rPr>
     </w:lvl>
   </w:abstractNum>
-  <w:abstractNum w:abstractNumId="2" w15:restartNumberingAfterBreak="0">
+  <w:abstractNum w:abstractNumId="4" w15:restartNumberingAfterBreak="0">
     <w:nsid w:val="70A36871"/>
     <w:multiLevelType w:val="multilevel"/>
     <w:tmpl w:val="E31C356E"/>
@@ -752,14 +1119,172 @@
       </w:rPr>
     </w:lvl>
   </w:abstractNum>
+  <w:abstractNum w:abstractNumId="5" w15:restartNumberingAfterBreak="0">
+    <w:nsid w:val="7EF43985"/>
+    <w:multiLevelType w:val="multilevel"/>
+    <w:tmpl w:val="D5884FE2"/>
+    <w:lvl w:ilvl="0">
+      <w:start w:val="1"/>
+      <w:numFmt w:val="bullet"/>
+      <w:lvlText w:val=""/>
+      <w:lvlJc w:val="left"/>
+      <w:pPr>
+        <w:tabs>
+          <w:tab w:val="num" w:pos="720"/>
+        </w:tabs>
+        <w:ind w:left="720" w:hanging="360"/>
+      </w:pPr>
+      <w:rPr>
+        <w:rFonts w:ascii="Symbol" w:hAnsi="Symbol" w:hint="default"/>
+        <w:sz w:val="20"/>
+      </w:rPr>
+    </w:lvl>
+    <w:lvl w:ilvl="1" w:tentative="1">
+      <w:start w:val="1"/>
+      <w:numFmt w:val="bullet"/>
+      <w:lvlText w:val="o"/>
+      <w:lvlJc w:val="left"/>
+      <w:pPr>
+        <w:tabs>
+          <w:tab w:val="num" w:pos="1440"/>
+        </w:tabs>
+        <w:ind w:left="1440" w:hanging="360"/>
+      </w:pPr>
+      <w:rPr>
+        <w:rFonts w:ascii="Courier New" w:hAnsi="Courier New" w:hint="default"/>
+        <w:sz w:val="20"/>
+      </w:rPr>
+    </w:lvl>
+    <w:lvl w:ilvl="2" w:tentative="1">
+      <w:start w:val="1"/>
+      <w:numFmt w:val="bullet"/>
+      <w:lvlText w:val=""/>
+      <w:lvlJc w:val="left"/>
+      <w:pPr>
+        <w:tabs>
+          <w:tab w:val="num" w:pos="2160"/>
+        </w:tabs>
+        <w:ind w:left="2160" w:hanging="360"/>
+      </w:pPr>
+      <w:rPr>
+        <w:rFonts w:ascii="Wingdings" w:hAnsi="Wingdings" w:hint="default"/>
+        <w:sz w:val="20"/>
+      </w:rPr>
+    </w:lvl>
+    <w:lvl w:ilvl="3" w:tentative="1">
+      <w:start w:val="1"/>
+      <w:numFmt w:val="bullet"/>
+      <w:lvlText w:val=""/>
+      <w:lvlJc w:val="left"/>
+      <w:pPr>
+        <w:tabs>
+          <w:tab w:val="num" w:pos="2880"/>
+        </w:tabs>
+        <w:ind w:left="2880" w:hanging="360"/>
+      </w:pPr>
+      <w:rPr>
+        <w:rFonts w:ascii="Wingdings" w:hAnsi="Wingdings" w:hint="default"/>
+        <w:sz w:val="20"/>
+      </w:rPr>
+    </w:lvl>
+    <w:lvl w:ilvl="4" w:tentative="1">
+      <w:start w:val="1"/>
+      <w:numFmt w:val="bullet"/>
+      <w:lvlText w:val=""/>
+      <w:lvlJc w:val="left"/>
+      <w:pPr>
+        <w:tabs>
+          <w:tab w:val="num" w:pos="3600"/>
+        </w:tabs>
+        <w:ind w:left="3600" w:hanging="360"/>
+      </w:pPr>
+      <w:rPr>
+        <w:rFonts w:ascii="Wingdings" w:hAnsi="Wingdings" w:hint="default"/>
+        <w:sz w:val="20"/>
+      </w:rPr>
+    </w:lvl>
+    <w:lvl w:ilvl="5" w:tentative="1">
+      <w:start w:val="1"/>
+      <w:numFmt w:val="bullet"/>
+      <w:lvlText w:val=""/>
+      <w:lvlJc w:val="left"/>
+      <w:pPr>
+        <w:tabs>
+          <w:tab w:val="num" w:pos="4320"/>
+        </w:tabs>
+        <w:ind w:left="4320" w:hanging="360"/>
+      </w:pPr>
+      <w:rPr>
+        <w:rFonts w:ascii="Wingdings" w:hAnsi="Wingdings" w:hint="default"/>
+        <w:sz w:val="20"/>
+      </w:rPr>
+    </w:lvl>
+    <w:lvl w:ilvl="6" w:tentative="1">
+      <w:start w:val="1"/>
+      <w:numFmt w:val="bullet"/>
+      <w:lvlText w:val=""/>
+      <w:lvlJc w:val="left"/>
+      <w:pPr>
+        <w:tabs>
+          <w:tab w:val="num" w:pos="5040"/>
+        </w:tabs>
+        <w:ind w:left="5040" w:hanging="360"/>
+      </w:pPr>
+      <w:rPr>
+        <w:rFonts w:ascii="Wingdings" w:hAnsi="Wingdings" w:hint="default"/>
+        <w:sz w:val="20"/>
+      </w:rPr>
+    </w:lvl>
+    <w:lvl w:ilvl="7" w:tentative="1">
+      <w:start w:val="1"/>
+      <w:numFmt w:val="bullet"/>
+      <w:lvlText w:val=""/>
+      <w:lvlJc w:val="left"/>
+      <w:pPr>
+        <w:tabs>
+          <w:tab w:val="num" w:pos="5760"/>
+        </w:tabs>
+        <w:ind w:left="5760" w:hanging="360"/>
+      </w:pPr>
+      <w:rPr>
+        <w:rFonts w:ascii="Wingdings" w:hAnsi="Wingdings" w:hint="default"/>
+        <w:sz w:val="20"/>
+      </w:rPr>
+    </w:lvl>
+    <w:lvl w:ilvl="8" w:tentative="1">
+      <w:start w:val="1"/>
+      <w:numFmt w:val="bullet"/>
+      <w:lvlText w:val=""/>
+      <w:lvlJc w:val="left"/>
+      <w:pPr>
+        <w:tabs>
+          <w:tab w:val="num" w:pos="6480"/>
+        </w:tabs>
+        <w:ind w:left="6480" w:hanging="360"/>
+      </w:pPr>
+      <w:rPr>
+        <w:rFonts w:ascii="Wingdings" w:hAnsi="Wingdings" w:hint="default"/>
+        <w:sz w:val="20"/>
+      </w:rPr>
+    </w:lvl>
+  </w:abstractNum>
   <w:num w:numId="1" w16cid:durableId="187763573">
+    <w:abstractNumId w:val="4"/>
+  </w:num>
+  <w:num w:numId="2" w16cid:durableId="562260487">
     <w:abstractNumId w:val="2"/>
   </w:num>
-  <w:num w:numId="2" w16cid:durableId="562260487">
+  <w:num w:numId="3" w16cid:durableId="81950270">
+    <w:abstractNumId w:val="3"/>
+  </w:num>
+  <w:num w:numId="4" w16cid:durableId="200561438">
+    <w:abstractNumId w:val="1"/>
+  </w:num>
+  <w:num w:numId="5" w16cid:durableId="157120126">
+    <w:abstractNumId w:val="5"/>
+  </w:num>
+  <w:num w:numId="6" w16cid:durableId="765156802">
     <w:abstractNumId w:val="0"/>
-  </w:num>
-  <w:num w:numId="3" w16cid:durableId="81950270">
-    <w:abstractNumId w:val="1"/>
   </w:num>
 </w:numbering>
 </file>

</xml_diff>